<commit_message>
docs(3cloud): add page 2 — Fabric vs Databricks tech component map
- gen_3cloud_cheatcard.py: second page with a 3-col component table
  (Layer | Microsoft Fabric | Azure Databricks) across 14 layers + naming-gotchas footer
- regenerate cheatcard .docx (now 2 pages)

Co-Authored-By: Claude Opus 4.8 (1M context) <noreply@anthropic.com>
</commit_message>
<xml_diff>
--- a/working-docs/docx/Mike_Vogt_3Cloud_Data_AI_SME_cheatcard_2026-06-17.docx
+++ b/working-docs/docx/Mike_Vogt_3Cloud_Data_AI_SME_cheatcard_2026-06-17.docx
@@ -1115,6 +1115,1275 @@
         <w:t>Posting expires Mon Jun 22 · virtual-first · ⚑FIX RESUME: Fabric=SPR POC (DBX won), PBM=AWS · Discovery-first · trade-offs · candor · player-coach.</w:t>
       </w:r>
     </w:p>
+    <w:p>
+      <w:r>
+        <w:br w:type="page"/>
+      </w:r>
+    </w:p>
+    <w:p>
+      <w:pPr>
+        <w:spacing w:after="20"/>
+        <w:jc w:val="center"/>
+      </w:pPr>
+      <w:r>
+        <w:rPr>
+          <w:rFonts w:ascii="Calibri" w:hAnsi="Calibri"/>
+          <w:b/>
+          <w:i w:val="0"/>
+          <w:color w:val="1F4E79"/>
+          <w:sz w:val="22"/>
+        </w:rPr>
+        <w:t>FABRIC &amp; DATABRICKS — TECH COMPONENT MAP (know the building blocks)</w:t>
+      </w:r>
+    </w:p>
+    <w:p>
+      <w:pPr>
+        <w:spacing w:before="0" w:after="80"/>
+        <w:jc w:val="center"/>
+      </w:pPr>
+      <w:r>
+        <w:rPr>
+          <w:rFonts w:ascii="Calibri" w:hAnsi="Calibri"/>
+          <w:b w:val="0"/>
+          <w:i/>
+          <w:color w:val="444444"/>
+          <w:sz w:val="15"/>
+        </w:rPr>
+        <w:t>Both run on Azure over Delta/OneLake — name the right component per layer.</w:t>
+      </w:r>
+    </w:p>
+    <w:tbl>
+      <w:tblPr>
+        <w:tblStyle w:val="TableGrid"/>
+        <w:tblW w:type="auto" w:w="0"/>
+        <w:tblLook w:firstColumn="1" w:firstRow="1" w:lastColumn="0" w:lastRow="0" w:noHBand="0" w:noVBand="1" w:val="04A0"/>
+      </w:tblPr>
+      <w:tblGrid>
+        <w:gridCol w:w="3696"/>
+        <w:gridCol w:w="3696"/>
+        <w:gridCol w:w="3696"/>
+      </w:tblGrid>
+      <w:tr>
+        <w:tc>
+          <w:tcPr>
+            <w:tcW w:type="dxa" w:w="1656"/>
+            <w:tcMar>
+              <w:top w:w="30" w:type="dxa"/>
+              <w:bottom w:w="30" w:type="dxa"/>
+              <w:left w:w="60" w:type="dxa"/>
+              <w:right w:w="60" w:type="dxa"/>
+            </w:tcMar>
+            <w:shd w:val="clear" w:fill="1F4E79"/>
+          </w:tcPr>
+          <w:p>
+            <w:pPr>
+              <w:spacing w:before="10" w:after="10" w:line="240" w:lineRule="auto"/>
+            </w:pPr>
+            <w:r>
+              <w:rPr>
+                <w:rFonts w:ascii="Calibri" w:hAnsi="Calibri"/>
+                <w:b/>
+                <w:i w:val="0"/>
+                <w:color w:val="FFFFFF"/>
+                <w:sz w:val="14"/>
+              </w:rPr>
+              <w:t>Layer</w:t>
+            </w:r>
+          </w:p>
+        </w:tc>
+        <w:tc>
+          <w:tcPr>
+            <w:tcW w:type="dxa" w:w="4536"/>
+            <w:tcMar>
+              <w:top w:w="30" w:type="dxa"/>
+              <w:bottom w:w="30" w:type="dxa"/>
+              <w:left w:w="60" w:type="dxa"/>
+              <w:right w:w="60" w:type="dxa"/>
+            </w:tcMar>
+            <w:shd w:val="clear" w:fill="1F4E79"/>
+          </w:tcPr>
+          <w:p>
+            <w:pPr>
+              <w:spacing w:before="10" w:after="10" w:line="240" w:lineRule="auto"/>
+            </w:pPr>
+            <w:r>
+              <w:rPr>
+                <w:rFonts w:ascii="Calibri" w:hAnsi="Calibri"/>
+                <w:b/>
+                <w:i w:val="0"/>
+                <w:color w:val="FFFFFF"/>
+                <w:sz w:val="14"/>
+              </w:rPr>
+              <w:t>Microsoft Fabric</w:t>
+            </w:r>
+          </w:p>
+        </w:tc>
+        <w:tc>
+          <w:tcPr>
+            <w:tcW w:type="dxa" w:w="4608"/>
+            <w:tcMar>
+              <w:top w:w="30" w:type="dxa"/>
+              <w:bottom w:w="30" w:type="dxa"/>
+              <w:left w:w="60" w:type="dxa"/>
+              <w:right w:w="60" w:type="dxa"/>
+            </w:tcMar>
+            <w:shd w:val="clear" w:fill="1F4E79"/>
+          </w:tcPr>
+          <w:p>
+            <w:pPr>
+              <w:spacing w:before="10" w:after="10" w:line="240" w:lineRule="auto"/>
+            </w:pPr>
+            <w:r>
+              <w:rPr>
+                <w:rFonts w:ascii="Calibri" w:hAnsi="Calibri"/>
+                <w:b/>
+                <w:i w:val="0"/>
+                <w:color w:val="FFFFFF"/>
+                <w:sz w:val="14"/>
+              </w:rPr>
+              <w:t>Azure Databricks</w:t>
+            </w:r>
+          </w:p>
+        </w:tc>
+      </w:tr>
+      <w:tr>
+        <w:tc>
+          <w:tcPr>
+            <w:tcW w:type="dxa" w:w="1656"/>
+            <w:tcMar>
+              <w:top w:w="30" w:type="dxa"/>
+              <w:bottom w:w="30" w:type="dxa"/>
+              <w:left w:w="60" w:type="dxa"/>
+              <w:right w:w="60" w:type="dxa"/>
+            </w:tcMar>
+          </w:tcPr>
+          <w:p>
+            <w:pPr>
+              <w:spacing w:before="10" w:after="10" w:line="240" w:lineRule="auto"/>
+            </w:pPr>
+            <w:r>
+              <w:rPr>
+                <w:rFonts w:ascii="Calibri" w:hAnsi="Calibri"/>
+                <w:b/>
+                <w:i w:val="0"/>
+                <w:color w:val="1F4E79"/>
+                <w:sz w:val="13"/>
+              </w:rPr>
+              <w:t>Storage / lake</w:t>
+            </w:r>
+          </w:p>
+        </w:tc>
+        <w:tc>
+          <w:tcPr>
+            <w:tcW w:type="dxa" w:w="4536"/>
+            <w:tcMar>
+              <w:top w:w="30" w:type="dxa"/>
+              <w:bottom w:w="30" w:type="dxa"/>
+              <w:left w:w="60" w:type="dxa"/>
+              <w:right w:w="60" w:type="dxa"/>
+            </w:tcMar>
+          </w:tcPr>
+          <w:p>
+            <w:pPr>
+              <w:spacing w:before="10" w:after="10" w:line="240" w:lineRule="auto"/>
+            </w:pPr>
+            <w:r>
+              <w:rPr>
+                <w:rFonts w:ascii="Calibri" w:hAnsi="Calibri"/>
+                <w:b w:val="0"/>
+                <w:i w:val="0"/>
+                <w:sz w:val="13"/>
+              </w:rPr>
+              <w:t>OneLake (one logical lake; Delta/Parquet); Shortcuts; Mirroring</w:t>
+            </w:r>
+          </w:p>
+        </w:tc>
+        <w:tc>
+          <w:tcPr>
+            <w:tcW w:type="dxa" w:w="4608"/>
+            <w:tcMar>
+              <w:top w:w="30" w:type="dxa"/>
+              <w:bottom w:w="30" w:type="dxa"/>
+              <w:left w:w="60" w:type="dxa"/>
+              <w:right w:w="60" w:type="dxa"/>
+            </w:tcMar>
+          </w:tcPr>
+          <w:p>
+            <w:pPr>
+              <w:spacing w:before="10" w:after="10" w:line="240" w:lineRule="auto"/>
+            </w:pPr>
+            <w:r>
+              <w:rPr>
+                <w:rFonts w:ascii="Calibri" w:hAnsi="Calibri"/>
+                <w:b w:val="0"/>
+                <w:i w:val="0"/>
+                <w:sz w:val="13"/>
+              </w:rPr>
+              <w:t>ADLS Gen2 + Delta Lake (UC managed/external); Delta Sharing</w:t>
+            </w:r>
+          </w:p>
+        </w:tc>
+      </w:tr>
+      <w:tr>
+        <w:tc>
+          <w:tcPr>
+            <w:tcW w:type="dxa" w:w="1656"/>
+            <w:tcMar>
+              <w:top w:w="30" w:type="dxa"/>
+              <w:bottom w:w="30" w:type="dxa"/>
+              <w:left w:w="60" w:type="dxa"/>
+              <w:right w:w="60" w:type="dxa"/>
+            </w:tcMar>
+            <w:shd w:val="clear" w:fill="EEF2F8"/>
+          </w:tcPr>
+          <w:p>
+            <w:pPr>
+              <w:spacing w:before="10" w:after="10" w:line="240" w:lineRule="auto"/>
+            </w:pPr>
+            <w:r>
+              <w:rPr>
+                <w:rFonts w:ascii="Calibri" w:hAnsi="Calibri"/>
+                <w:b/>
+                <w:i w:val="0"/>
+                <w:color w:val="1F4E79"/>
+                <w:sz w:val="13"/>
+              </w:rPr>
+              <w:t>Table format</w:t>
+            </w:r>
+          </w:p>
+        </w:tc>
+        <w:tc>
+          <w:tcPr>
+            <w:tcW w:type="dxa" w:w="4536"/>
+            <w:tcMar>
+              <w:top w:w="30" w:type="dxa"/>
+              <w:bottom w:w="30" w:type="dxa"/>
+              <w:left w:w="60" w:type="dxa"/>
+              <w:right w:w="60" w:type="dxa"/>
+            </w:tcMar>
+            <w:shd w:val="clear" w:fill="EEF2F8"/>
+          </w:tcPr>
+          <w:p>
+            <w:pPr>
+              <w:spacing w:before="10" w:after="10" w:line="240" w:lineRule="auto"/>
+            </w:pPr>
+            <w:r>
+              <w:rPr>
+                <w:rFonts w:ascii="Calibri" w:hAnsi="Calibri"/>
+                <w:b w:val="0"/>
+                <w:i w:val="0"/>
+                <w:sz w:val="13"/>
+              </w:rPr>
+              <w:t>Delta; Iceberg (preview)</w:t>
+            </w:r>
+          </w:p>
+        </w:tc>
+        <w:tc>
+          <w:tcPr>
+            <w:tcW w:type="dxa" w:w="4608"/>
+            <w:tcMar>
+              <w:top w:w="30" w:type="dxa"/>
+              <w:bottom w:w="30" w:type="dxa"/>
+              <w:left w:w="60" w:type="dxa"/>
+              <w:right w:w="60" w:type="dxa"/>
+            </w:tcMar>
+            <w:shd w:val="clear" w:fill="EEF2F8"/>
+          </w:tcPr>
+          <w:p>
+            <w:pPr>
+              <w:spacing w:before="10" w:after="10" w:line="240" w:lineRule="auto"/>
+            </w:pPr>
+            <w:r>
+              <w:rPr>
+                <w:rFonts w:ascii="Calibri" w:hAnsi="Calibri"/>
+                <w:b w:val="0"/>
+                <w:i w:val="0"/>
+                <w:sz w:val="13"/>
+              </w:rPr>
+              <w:t>Delta Lake; UniForm (read as Iceberg/Hudi); Iceberg</w:t>
+            </w:r>
+          </w:p>
+        </w:tc>
+      </w:tr>
+      <w:tr>
+        <w:tc>
+          <w:tcPr>
+            <w:tcW w:type="dxa" w:w="1656"/>
+            <w:tcMar>
+              <w:top w:w="30" w:type="dxa"/>
+              <w:bottom w:w="30" w:type="dxa"/>
+              <w:left w:w="60" w:type="dxa"/>
+              <w:right w:w="60" w:type="dxa"/>
+            </w:tcMar>
+          </w:tcPr>
+          <w:p>
+            <w:pPr>
+              <w:spacing w:before="10" w:after="10" w:line="240" w:lineRule="auto"/>
+            </w:pPr>
+            <w:r>
+              <w:rPr>
+                <w:rFonts w:ascii="Calibri" w:hAnsi="Calibri"/>
+                <w:b/>
+                <w:i w:val="0"/>
+                <w:color w:val="1F4E79"/>
+                <w:sz w:val="13"/>
+              </w:rPr>
+              <w:t>Compute / engine</w:t>
+            </w:r>
+          </w:p>
+        </w:tc>
+        <w:tc>
+          <w:tcPr>
+            <w:tcW w:type="dxa" w:w="4536"/>
+            <w:tcMar>
+              <w:top w:w="30" w:type="dxa"/>
+              <w:bottom w:w="30" w:type="dxa"/>
+              <w:left w:w="60" w:type="dxa"/>
+              <w:right w:w="60" w:type="dxa"/>
+            </w:tcMar>
+          </w:tcPr>
+          <w:p>
+            <w:pPr>
+              <w:spacing w:before="10" w:after="10" w:line="240" w:lineRule="auto"/>
+            </w:pPr>
+            <w:r>
+              <w:rPr>
+                <w:rFonts w:ascii="Calibri" w:hAnsi="Calibri"/>
+                <w:b w:val="0"/>
+                <w:i w:val="0"/>
+                <w:sz w:val="13"/>
+              </w:rPr>
+              <w:t>Spark (Fabric runtime); SQL analytics endpoint; Warehouse (T-SQL)</w:t>
+            </w:r>
+          </w:p>
+        </w:tc>
+        <w:tc>
+          <w:tcPr>
+            <w:tcW w:type="dxa" w:w="4608"/>
+            <w:tcMar>
+              <w:top w:w="30" w:type="dxa"/>
+              <w:bottom w:w="30" w:type="dxa"/>
+              <w:left w:w="60" w:type="dxa"/>
+              <w:right w:w="60" w:type="dxa"/>
+            </w:tcMar>
+          </w:tcPr>
+          <w:p>
+            <w:pPr>
+              <w:spacing w:before="10" w:after="10" w:line="240" w:lineRule="auto"/>
+            </w:pPr>
+            <w:r>
+              <w:rPr>
+                <w:rFonts w:ascii="Calibri" w:hAnsi="Calibri"/>
+                <w:b w:val="0"/>
+                <w:i w:val="0"/>
+                <w:sz w:val="13"/>
+              </w:rPr>
+              <w:t>Spark clusters (job/all-purpose); Photon; Serverless SQL warehouses</w:t>
+            </w:r>
+          </w:p>
+        </w:tc>
+      </w:tr>
+      <w:tr>
+        <w:tc>
+          <w:tcPr>
+            <w:tcW w:type="dxa" w:w="1656"/>
+            <w:tcMar>
+              <w:top w:w="30" w:type="dxa"/>
+              <w:bottom w:w="30" w:type="dxa"/>
+              <w:left w:w="60" w:type="dxa"/>
+              <w:right w:w="60" w:type="dxa"/>
+            </w:tcMar>
+            <w:shd w:val="clear" w:fill="EEF2F8"/>
+          </w:tcPr>
+          <w:p>
+            <w:pPr>
+              <w:spacing w:before="10" w:after="10" w:line="240" w:lineRule="auto"/>
+            </w:pPr>
+            <w:r>
+              <w:rPr>
+                <w:rFonts w:ascii="Calibri" w:hAnsi="Calibri"/>
+                <w:b/>
+                <w:i w:val="0"/>
+                <w:color w:val="1F4E79"/>
+                <w:sz w:val="13"/>
+              </w:rPr>
+              <w:t>Ingestion</w:t>
+            </w:r>
+          </w:p>
+        </w:tc>
+        <w:tc>
+          <w:tcPr>
+            <w:tcW w:type="dxa" w:w="4536"/>
+            <w:tcMar>
+              <w:top w:w="30" w:type="dxa"/>
+              <w:bottom w:w="30" w:type="dxa"/>
+              <w:left w:w="60" w:type="dxa"/>
+              <w:right w:w="60" w:type="dxa"/>
+            </w:tcMar>
+            <w:shd w:val="clear" w:fill="EEF2F8"/>
+          </w:tcPr>
+          <w:p>
+            <w:pPr>
+              <w:spacing w:before="10" w:after="10" w:line="240" w:lineRule="auto"/>
+            </w:pPr>
+            <w:r>
+              <w:rPr>
+                <w:rFonts w:ascii="Calibri" w:hAnsi="Calibri"/>
+                <w:b w:val="0"/>
+                <w:i w:val="0"/>
+                <w:sz w:val="13"/>
+              </w:rPr>
+              <w:t>Data Factory pipelines; Dataflows Gen2; Copy job; Mirroring</w:t>
+            </w:r>
+          </w:p>
+        </w:tc>
+        <w:tc>
+          <w:tcPr>
+            <w:tcW w:type="dxa" w:w="4608"/>
+            <w:tcMar>
+              <w:top w:w="30" w:type="dxa"/>
+              <w:bottom w:w="30" w:type="dxa"/>
+              <w:left w:w="60" w:type="dxa"/>
+              <w:right w:w="60" w:type="dxa"/>
+            </w:tcMar>
+            <w:shd w:val="clear" w:fill="EEF2F8"/>
+          </w:tcPr>
+          <w:p>
+            <w:pPr>
+              <w:spacing w:before="10" w:after="10" w:line="240" w:lineRule="auto"/>
+            </w:pPr>
+            <w:r>
+              <w:rPr>
+                <w:rFonts w:ascii="Calibri" w:hAnsi="Calibri"/>
+                <w:b w:val="0"/>
+                <w:i w:val="0"/>
+                <w:sz w:val="13"/>
+              </w:rPr>
+              <w:t>Lakeflow Connect; Auto Loader; Structured Streaming; partner connectors</w:t>
+            </w:r>
+          </w:p>
+        </w:tc>
+      </w:tr>
+      <w:tr>
+        <w:tc>
+          <w:tcPr>
+            <w:tcW w:type="dxa" w:w="1656"/>
+            <w:tcMar>
+              <w:top w:w="30" w:type="dxa"/>
+              <w:bottom w:w="30" w:type="dxa"/>
+              <w:left w:w="60" w:type="dxa"/>
+              <w:right w:w="60" w:type="dxa"/>
+            </w:tcMar>
+          </w:tcPr>
+          <w:p>
+            <w:pPr>
+              <w:spacing w:before="10" w:after="10" w:line="240" w:lineRule="auto"/>
+            </w:pPr>
+            <w:r>
+              <w:rPr>
+                <w:rFonts w:ascii="Calibri" w:hAnsi="Calibri"/>
+                <w:b/>
+                <w:i w:val="0"/>
+                <w:color w:val="1F4E79"/>
+                <w:sz w:val="13"/>
+              </w:rPr>
+              <w:t>ELT / transform</w:t>
+            </w:r>
+          </w:p>
+        </w:tc>
+        <w:tc>
+          <w:tcPr>
+            <w:tcW w:type="dxa" w:w="4536"/>
+            <w:tcMar>
+              <w:top w:w="30" w:type="dxa"/>
+              <w:bottom w:w="30" w:type="dxa"/>
+              <w:left w:w="60" w:type="dxa"/>
+              <w:right w:w="60" w:type="dxa"/>
+            </w:tcMar>
+          </w:tcPr>
+          <w:p>
+            <w:pPr>
+              <w:spacing w:before="10" w:after="10" w:line="240" w:lineRule="auto"/>
+            </w:pPr>
+            <w:r>
+              <w:rPr>
+                <w:rFonts w:ascii="Calibri" w:hAnsi="Calibri"/>
+                <w:b w:val="0"/>
+                <w:i w:val="0"/>
+                <w:sz w:val="13"/>
+              </w:rPr>
+              <w:t>Notebooks (PySpark/SQL); Dataflows Gen2; T-SQL</w:t>
+            </w:r>
+          </w:p>
+        </w:tc>
+        <w:tc>
+          <w:tcPr>
+            <w:tcW w:type="dxa" w:w="4608"/>
+            <w:tcMar>
+              <w:top w:w="30" w:type="dxa"/>
+              <w:bottom w:w="30" w:type="dxa"/>
+              <w:left w:w="60" w:type="dxa"/>
+              <w:right w:w="60" w:type="dxa"/>
+            </w:tcMar>
+          </w:tcPr>
+          <w:p>
+            <w:pPr>
+              <w:spacing w:before="10" w:after="10" w:line="240" w:lineRule="auto"/>
+            </w:pPr>
+            <w:r>
+              <w:rPr>
+                <w:rFonts w:ascii="Calibri" w:hAnsi="Calibri"/>
+                <w:b w:val="0"/>
+                <w:i w:val="0"/>
+                <w:sz w:val="13"/>
+              </w:rPr>
+              <w:t>Notebooks; Lakeflow Declarative Pipelines (was DLT); dbt</w:t>
+            </w:r>
+          </w:p>
+        </w:tc>
+      </w:tr>
+      <w:tr>
+        <w:tc>
+          <w:tcPr>
+            <w:tcW w:type="dxa" w:w="1656"/>
+            <w:tcMar>
+              <w:top w:w="30" w:type="dxa"/>
+              <w:bottom w:w="30" w:type="dxa"/>
+              <w:left w:w="60" w:type="dxa"/>
+              <w:right w:w="60" w:type="dxa"/>
+            </w:tcMar>
+            <w:shd w:val="clear" w:fill="EEF2F8"/>
+          </w:tcPr>
+          <w:p>
+            <w:pPr>
+              <w:spacing w:before="10" w:after="10" w:line="240" w:lineRule="auto"/>
+            </w:pPr>
+            <w:r>
+              <w:rPr>
+                <w:rFonts w:ascii="Calibri" w:hAnsi="Calibri"/>
+                <w:b/>
+                <w:i w:val="0"/>
+                <w:color w:val="1F4E79"/>
+                <w:sz w:val="13"/>
+              </w:rPr>
+              <w:t>Orchestration</w:t>
+            </w:r>
+          </w:p>
+        </w:tc>
+        <w:tc>
+          <w:tcPr>
+            <w:tcW w:type="dxa" w:w="4536"/>
+            <w:tcMar>
+              <w:top w:w="30" w:type="dxa"/>
+              <w:bottom w:w="30" w:type="dxa"/>
+              <w:left w:w="60" w:type="dxa"/>
+              <w:right w:w="60" w:type="dxa"/>
+            </w:tcMar>
+            <w:shd w:val="clear" w:fill="EEF2F8"/>
+          </w:tcPr>
+          <w:p>
+            <w:pPr>
+              <w:spacing w:before="10" w:after="10" w:line="240" w:lineRule="auto"/>
+            </w:pPr>
+            <w:r>
+              <w:rPr>
+                <w:rFonts w:ascii="Calibri" w:hAnsi="Calibri"/>
+                <w:b w:val="0"/>
+                <w:i w:val="0"/>
+                <w:sz w:val="13"/>
+              </w:rPr>
+              <w:t>Fabric Data Factory pipelines + scheduler</w:t>
+            </w:r>
+          </w:p>
+        </w:tc>
+        <w:tc>
+          <w:tcPr>
+            <w:tcW w:type="dxa" w:w="4608"/>
+            <w:tcMar>
+              <w:top w:w="30" w:type="dxa"/>
+              <w:bottom w:w="30" w:type="dxa"/>
+              <w:left w:w="60" w:type="dxa"/>
+              <w:right w:w="60" w:type="dxa"/>
+            </w:tcMar>
+            <w:shd w:val="clear" w:fill="EEF2F8"/>
+          </w:tcPr>
+          <w:p>
+            <w:pPr>
+              <w:spacing w:before="10" w:after="10" w:line="240" w:lineRule="auto"/>
+            </w:pPr>
+            <w:r>
+              <w:rPr>
+                <w:rFonts w:ascii="Calibri" w:hAnsi="Calibri"/>
+                <w:b w:val="0"/>
+                <w:i w:val="0"/>
+                <w:sz w:val="13"/>
+              </w:rPr>
+              <w:t>Lakeflow Jobs (was Workflows); Asset Bundles (DABs)</w:t>
+            </w:r>
+          </w:p>
+        </w:tc>
+      </w:tr>
+      <w:tr>
+        <w:tc>
+          <w:tcPr>
+            <w:tcW w:type="dxa" w:w="1656"/>
+            <w:tcMar>
+              <w:top w:w="30" w:type="dxa"/>
+              <w:bottom w:w="30" w:type="dxa"/>
+              <w:left w:w="60" w:type="dxa"/>
+              <w:right w:w="60" w:type="dxa"/>
+            </w:tcMar>
+          </w:tcPr>
+          <w:p>
+            <w:pPr>
+              <w:spacing w:before="10" w:after="10" w:line="240" w:lineRule="auto"/>
+            </w:pPr>
+            <w:r>
+              <w:rPr>
+                <w:rFonts w:ascii="Calibri" w:hAnsi="Calibri"/>
+                <w:b/>
+                <w:i w:val="0"/>
+                <w:color w:val="1F4E79"/>
+                <w:sz w:val="13"/>
+              </w:rPr>
+              <w:t>Catalog / govern</w:t>
+            </w:r>
+          </w:p>
+        </w:tc>
+        <w:tc>
+          <w:tcPr>
+            <w:tcW w:type="dxa" w:w="4536"/>
+            <w:tcMar>
+              <w:top w:w="30" w:type="dxa"/>
+              <w:bottom w:w="30" w:type="dxa"/>
+              <w:left w:w="60" w:type="dxa"/>
+              <w:right w:w="60" w:type="dxa"/>
+            </w:tcMar>
+          </w:tcPr>
+          <w:p>
+            <w:pPr>
+              <w:spacing w:before="10" w:after="10" w:line="240" w:lineRule="auto"/>
+            </w:pPr>
+            <w:r>
+              <w:rPr>
+                <w:rFonts w:ascii="Calibri" w:hAnsi="Calibri"/>
+                <w:b w:val="0"/>
+                <w:i w:val="0"/>
+                <w:sz w:val="13"/>
+              </w:rPr>
+              <w:t>OneLake catalog; Domains; Purview; workspace roles; sensitivity labels</w:t>
+            </w:r>
+          </w:p>
+        </w:tc>
+        <w:tc>
+          <w:tcPr>
+            <w:tcW w:type="dxa" w:w="4608"/>
+            <w:tcMar>
+              <w:top w:w="30" w:type="dxa"/>
+              <w:bottom w:w="30" w:type="dxa"/>
+              <w:left w:w="60" w:type="dxa"/>
+              <w:right w:w="60" w:type="dxa"/>
+            </w:tcMar>
+          </w:tcPr>
+          <w:p>
+            <w:pPr>
+              <w:spacing w:before="10" w:after="10" w:line="240" w:lineRule="auto"/>
+            </w:pPr>
+            <w:r>
+              <w:rPr>
+                <w:rFonts w:ascii="Calibri" w:hAnsi="Calibri"/>
+                <w:b w:val="0"/>
+                <w:i w:val="0"/>
+                <w:sz w:val="13"/>
+              </w:rPr>
+              <w:t>Unity Catalog (catalog→schema→table); lineage; ABAC, row/column masks</w:t>
+            </w:r>
+          </w:p>
+        </w:tc>
+      </w:tr>
+      <w:tr>
+        <w:tc>
+          <w:tcPr>
+            <w:tcW w:type="dxa" w:w="1656"/>
+            <w:tcMar>
+              <w:top w:w="30" w:type="dxa"/>
+              <w:bottom w:w="30" w:type="dxa"/>
+              <w:left w:w="60" w:type="dxa"/>
+              <w:right w:w="60" w:type="dxa"/>
+            </w:tcMar>
+            <w:shd w:val="clear" w:fill="EEF2F8"/>
+          </w:tcPr>
+          <w:p>
+            <w:pPr>
+              <w:spacing w:before="10" w:after="10" w:line="240" w:lineRule="auto"/>
+            </w:pPr>
+            <w:r>
+              <w:rPr>
+                <w:rFonts w:ascii="Calibri" w:hAnsi="Calibri"/>
+                <w:b/>
+                <w:i w:val="0"/>
+                <w:color w:val="1F4E79"/>
+                <w:sz w:val="13"/>
+              </w:rPr>
+              <w:t>Semantic / BI</w:t>
+            </w:r>
+          </w:p>
+        </w:tc>
+        <w:tc>
+          <w:tcPr>
+            <w:tcW w:type="dxa" w:w="4536"/>
+            <w:tcMar>
+              <w:top w:w="30" w:type="dxa"/>
+              <w:bottom w:w="30" w:type="dxa"/>
+              <w:left w:w="60" w:type="dxa"/>
+              <w:right w:w="60" w:type="dxa"/>
+            </w:tcMar>
+            <w:shd w:val="clear" w:fill="EEF2F8"/>
+          </w:tcPr>
+          <w:p>
+            <w:pPr>
+              <w:spacing w:before="10" w:after="10" w:line="240" w:lineRule="auto"/>
+            </w:pPr>
+            <w:r>
+              <w:rPr>
+                <w:rFonts w:ascii="Calibri" w:hAnsi="Calibri"/>
+                <w:b w:val="0"/>
+                <w:i w:val="0"/>
+                <w:sz w:val="13"/>
+              </w:rPr>
+              <w:t>Power BI: Direct Lake / Import / DirectQuery; semantic models; Copilot</w:t>
+            </w:r>
+          </w:p>
+        </w:tc>
+        <w:tc>
+          <w:tcPr>
+            <w:tcW w:type="dxa" w:w="4608"/>
+            <w:tcMar>
+              <w:top w:w="30" w:type="dxa"/>
+              <w:bottom w:w="30" w:type="dxa"/>
+              <w:left w:w="60" w:type="dxa"/>
+              <w:right w:w="60" w:type="dxa"/>
+            </w:tcMar>
+            <w:shd w:val="clear" w:fill="EEF2F8"/>
+          </w:tcPr>
+          <w:p>
+            <w:pPr>
+              <w:spacing w:before="10" w:after="10" w:line="240" w:lineRule="auto"/>
+            </w:pPr>
+            <w:r>
+              <w:rPr>
+                <w:rFonts w:ascii="Calibri" w:hAnsi="Calibri"/>
+                <w:b w:val="0"/>
+                <w:i w:val="0"/>
+                <w:sz w:val="13"/>
+              </w:rPr>
+              <w:t>Databricks SQL; AI/BI Dashboards; Genie (NL→SQL); Power BI connector</w:t>
+            </w:r>
+          </w:p>
+        </w:tc>
+      </w:tr>
+      <w:tr>
+        <w:tc>
+          <w:tcPr>
+            <w:tcW w:type="dxa" w:w="1656"/>
+            <w:tcMar>
+              <w:top w:w="30" w:type="dxa"/>
+              <w:bottom w:w="30" w:type="dxa"/>
+              <w:left w:w="60" w:type="dxa"/>
+              <w:right w:w="60" w:type="dxa"/>
+            </w:tcMar>
+          </w:tcPr>
+          <w:p>
+            <w:pPr>
+              <w:spacing w:before="10" w:after="10" w:line="240" w:lineRule="auto"/>
+            </w:pPr>
+            <w:r>
+              <w:rPr>
+                <w:rFonts w:ascii="Calibri" w:hAnsi="Calibri"/>
+                <w:b/>
+                <w:i w:val="0"/>
+                <w:color w:val="1F4E79"/>
+                <w:sz w:val="13"/>
+              </w:rPr>
+              <w:t>Real-time</w:t>
+            </w:r>
+          </w:p>
+        </w:tc>
+        <w:tc>
+          <w:tcPr>
+            <w:tcW w:type="dxa" w:w="4536"/>
+            <w:tcMar>
+              <w:top w:w="30" w:type="dxa"/>
+              <w:bottom w:w="30" w:type="dxa"/>
+              <w:left w:w="60" w:type="dxa"/>
+              <w:right w:w="60" w:type="dxa"/>
+            </w:tcMar>
+          </w:tcPr>
+          <w:p>
+            <w:pPr>
+              <w:spacing w:before="10" w:after="10" w:line="240" w:lineRule="auto"/>
+            </w:pPr>
+            <w:r>
+              <w:rPr>
+                <w:rFonts w:ascii="Calibri" w:hAnsi="Calibri"/>
+                <w:b w:val="0"/>
+                <w:i w:val="0"/>
+                <w:sz w:val="13"/>
+              </w:rPr>
+              <w:t>Real-Time Intelligence: Eventstream, Eventhouse (KQL), Activator</w:t>
+            </w:r>
+          </w:p>
+        </w:tc>
+        <w:tc>
+          <w:tcPr>
+            <w:tcW w:type="dxa" w:w="4608"/>
+            <w:tcMar>
+              <w:top w:w="30" w:type="dxa"/>
+              <w:bottom w:w="30" w:type="dxa"/>
+              <w:left w:w="60" w:type="dxa"/>
+              <w:right w:w="60" w:type="dxa"/>
+            </w:tcMar>
+          </w:tcPr>
+          <w:p>
+            <w:pPr>
+              <w:spacing w:before="10" w:after="10" w:line="240" w:lineRule="auto"/>
+            </w:pPr>
+            <w:r>
+              <w:rPr>
+                <w:rFonts w:ascii="Calibri" w:hAnsi="Calibri"/>
+                <w:b w:val="0"/>
+                <w:i w:val="0"/>
+                <w:sz w:val="13"/>
+              </w:rPr>
+              <w:t>Structured Streaming; streaming tables; Kafka / Event Hubs connectors</w:t>
+            </w:r>
+          </w:p>
+        </w:tc>
+      </w:tr>
+      <w:tr>
+        <w:tc>
+          <w:tcPr>
+            <w:tcW w:type="dxa" w:w="1656"/>
+            <w:tcMar>
+              <w:top w:w="30" w:type="dxa"/>
+              <w:bottom w:w="30" w:type="dxa"/>
+              <w:left w:w="60" w:type="dxa"/>
+              <w:right w:w="60" w:type="dxa"/>
+            </w:tcMar>
+            <w:shd w:val="clear" w:fill="EEF2F8"/>
+          </w:tcPr>
+          <w:p>
+            <w:pPr>
+              <w:spacing w:before="10" w:after="10" w:line="240" w:lineRule="auto"/>
+            </w:pPr>
+            <w:r>
+              <w:rPr>
+                <w:rFonts w:ascii="Calibri" w:hAnsi="Calibri"/>
+                <w:b/>
+                <w:i w:val="0"/>
+                <w:color w:val="1F4E79"/>
+                <w:sz w:val="13"/>
+              </w:rPr>
+              <w:t>ML</w:t>
+            </w:r>
+          </w:p>
+        </w:tc>
+        <w:tc>
+          <w:tcPr>
+            <w:tcW w:type="dxa" w:w="4536"/>
+            <w:tcMar>
+              <w:top w:w="30" w:type="dxa"/>
+              <w:bottom w:w="30" w:type="dxa"/>
+              <w:left w:w="60" w:type="dxa"/>
+              <w:right w:w="60" w:type="dxa"/>
+            </w:tcMar>
+            <w:shd w:val="clear" w:fill="EEF2F8"/>
+          </w:tcPr>
+          <w:p>
+            <w:pPr>
+              <w:spacing w:before="10" w:after="10" w:line="240" w:lineRule="auto"/>
+            </w:pPr>
+            <w:r>
+              <w:rPr>
+                <w:rFonts w:ascii="Calibri" w:hAnsi="Calibri"/>
+                <w:b w:val="0"/>
+                <w:i w:val="0"/>
+                <w:sz w:val="13"/>
+              </w:rPr>
+              <w:t>Data Science: MLflow, SynapseML, AutoML</w:t>
+            </w:r>
+          </w:p>
+        </w:tc>
+        <w:tc>
+          <w:tcPr>
+            <w:tcW w:type="dxa" w:w="4608"/>
+            <w:tcMar>
+              <w:top w:w="30" w:type="dxa"/>
+              <w:bottom w:w="30" w:type="dxa"/>
+              <w:left w:w="60" w:type="dxa"/>
+              <w:right w:w="60" w:type="dxa"/>
+            </w:tcMar>
+            <w:shd w:val="clear" w:fill="EEF2F8"/>
+          </w:tcPr>
+          <w:p>
+            <w:pPr>
+              <w:spacing w:before="10" w:after="10" w:line="240" w:lineRule="auto"/>
+            </w:pPr>
+            <w:r>
+              <w:rPr>
+                <w:rFonts w:ascii="Calibri" w:hAnsi="Calibri"/>
+                <w:b w:val="0"/>
+                <w:i w:val="0"/>
+                <w:sz w:val="13"/>
+              </w:rPr>
+              <w:t>Mosaic AI: Feature Store, AutoML, MLflow, Model Registry, Model Serving</w:t>
+            </w:r>
+          </w:p>
+        </w:tc>
+      </w:tr>
+      <w:tr>
+        <w:tc>
+          <w:tcPr>
+            <w:tcW w:type="dxa" w:w="1656"/>
+            <w:tcMar>
+              <w:top w:w="30" w:type="dxa"/>
+              <w:bottom w:w="30" w:type="dxa"/>
+              <w:left w:w="60" w:type="dxa"/>
+              <w:right w:w="60" w:type="dxa"/>
+            </w:tcMar>
+          </w:tcPr>
+          <w:p>
+            <w:pPr>
+              <w:spacing w:before="10" w:after="10" w:line="240" w:lineRule="auto"/>
+            </w:pPr>
+            <w:r>
+              <w:rPr>
+                <w:rFonts w:ascii="Calibri" w:hAnsi="Calibri"/>
+                <w:b/>
+                <w:i w:val="0"/>
+                <w:color w:val="1F4E79"/>
+                <w:sz w:val="13"/>
+              </w:rPr>
+              <w:t>GenAI / LLM</w:t>
+            </w:r>
+          </w:p>
+        </w:tc>
+        <w:tc>
+          <w:tcPr>
+            <w:tcW w:type="dxa" w:w="4536"/>
+            <w:tcMar>
+              <w:top w:w="30" w:type="dxa"/>
+              <w:bottom w:w="30" w:type="dxa"/>
+              <w:left w:w="60" w:type="dxa"/>
+              <w:right w:w="60" w:type="dxa"/>
+            </w:tcMar>
+          </w:tcPr>
+          <w:p>
+            <w:pPr>
+              <w:spacing w:before="10" w:after="10" w:line="240" w:lineRule="auto"/>
+            </w:pPr>
+            <w:r>
+              <w:rPr>
+                <w:rFonts w:ascii="Calibri" w:hAnsi="Calibri"/>
+                <w:b w:val="0"/>
+                <w:i w:val="0"/>
+                <w:sz w:val="13"/>
+              </w:rPr>
+              <w:t>Azure OpenAI integration; AI Skills; Fabric Copilot; Copilot Studio</w:t>
+            </w:r>
+          </w:p>
+        </w:tc>
+        <w:tc>
+          <w:tcPr>
+            <w:tcW w:type="dxa" w:w="4608"/>
+            <w:tcMar>
+              <w:top w:w="30" w:type="dxa"/>
+              <w:bottom w:w="30" w:type="dxa"/>
+              <w:left w:w="60" w:type="dxa"/>
+              <w:right w:w="60" w:type="dxa"/>
+            </w:tcMar>
+          </w:tcPr>
+          <w:p>
+            <w:pPr>
+              <w:spacing w:before="10" w:after="10" w:line="240" w:lineRule="auto"/>
+            </w:pPr>
+            <w:r>
+              <w:rPr>
+                <w:rFonts w:ascii="Calibri" w:hAnsi="Calibri"/>
+                <w:b w:val="0"/>
+                <w:i w:val="0"/>
+                <w:sz w:val="13"/>
+              </w:rPr>
+              <w:t>Mosaic AI: Vector Search, Agent Framework, Foundation Model APIs, AI Gateway</w:t>
+            </w:r>
+          </w:p>
+        </w:tc>
+      </w:tr>
+      <w:tr>
+        <w:tc>
+          <w:tcPr>
+            <w:tcW w:type="dxa" w:w="1656"/>
+            <w:tcMar>
+              <w:top w:w="30" w:type="dxa"/>
+              <w:bottom w:w="30" w:type="dxa"/>
+              <w:left w:w="60" w:type="dxa"/>
+              <w:right w:w="60" w:type="dxa"/>
+            </w:tcMar>
+            <w:shd w:val="clear" w:fill="EEF2F8"/>
+          </w:tcPr>
+          <w:p>
+            <w:pPr>
+              <w:spacing w:before="10" w:after="10" w:line="240" w:lineRule="auto"/>
+            </w:pPr>
+            <w:r>
+              <w:rPr>
+                <w:rFonts w:ascii="Calibri" w:hAnsi="Calibri"/>
+                <w:b/>
+                <w:i w:val="0"/>
+                <w:color w:val="1F4E79"/>
+                <w:sz w:val="13"/>
+              </w:rPr>
+              <w:t>DevOps / CI-CD</w:t>
+            </w:r>
+          </w:p>
+        </w:tc>
+        <w:tc>
+          <w:tcPr>
+            <w:tcW w:type="dxa" w:w="4536"/>
+            <w:tcMar>
+              <w:top w:w="30" w:type="dxa"/>
+              <w:bottom w:w="30" w:type="dxa"/>
+              <w:left w:w="60" w:type="dxa"/>
+              <w:right w:w="60" w:type="dxa"/>
+            </w:tcMar>
+            <w:shd w:val="clear" w:fill="EEF2F8"/>
+          </w:tcPr>
+          <w:p>
+            <w:pPr>
+              <w:spacing w:before="10" w:after="10" w:line="240" w:lineRule="auto"/>
+            </w:pPr>
+            <w:r>
+              <w:rPr>
+                <w:rFonts w:ascii="Calibri" w:hAnsi="Calibri"/>
+                <w:b w:val="0"/>
+                <w:i w:val="0"/>
+                <w:sz w:val="13"/>
+              </w:rPr>
+              <w:t>Git integration; deployment pipelines (dev/test/prod)</w:t>
+            </w:r>
+          </w:p>
+        </w:tc>
+        <w:tc>
+          <w:tcPr>
+            <w:tcW w:type="dxa" w:w="4608"/>
+            <w:tcMar>
+              <w:top w:w="30" w:type="dxa"/>
+              <w:bottom w:w="30" w:type="dxa"/>
+              <w:left w:w="60" w:type="dxa"/>
+              <w:right w:w="60" w:type="dxa"/>
+            </w:tcMar>
+            <w:shd w:val="clear" w:fill="EEF2F8"/>
+          </w:tcPr>
+          <w:p>
+            <w:pPr>
+              <w:spacing w:before="10" w:after="10" w:line="240" w:lineRule="auto"/>
+            </w:pPr>
+            <w:r>
+              <w:rPr>
+                <w:rFonts w:ascii="Calibri" w:hAnsi="Calibri"/>
+                <w:b w:val="0"/>
+                <w:i w:val="0"/>
+                <w:sz w:val="13"/>
+              </w:rPr>
+              <w:t>Asset Bundles (DABs); Terraform provider; Repos</w:t>
+            </w:r>
+          </w:p>
+        </w:tc>
+      </w:tr>
+      <w:tr>
+        <w:tc>
+          <w:tcPr>
+            <w:tcW w:type="dxa" w:w="1656"/>
+            <w:tcMar>
+              <w:top w:w="30" w:type="dxa"/>
+              <w:bottom w:w="30" w:type="dxa"/>
+              <w:left w:w="60" w:type="dxa"/>
+              <w:right w:w="60" w:type="dxa"/>
+            </w:tcMar>
+          </w:tcPr>
+          <w:p>
+            <w:pPr>
+              <w:spacing w:before="10" w:after="10" w:line="240" w:lineRule="auto"/>
+            </w:pPr>
+            <w:r>
+              <w:rPr>
+                <w:rFonts w:ascii="Calibri" w:hAnsi="Calibri"/>
+                <w:b/>
+                <w:i w:val="0"/>
+                <w:color w:val="1F4E79"/>
+                <w:sz w:val="13"/>
+              </w:rPr>
+              <w:t>Security</w:t>
+            </w:r>
+          </w:p>
+        </w:tc>
+        <w:tc>
+          <w:tcPr>
+            <w:tcW w:type="dxa" w:w="4536"/>
+            <w:tcMar>
+              <w:top w:w="30" w:type="dxa"/>
+              <w:bottom w:w="30" w:type="dxa"/>
+              <w:left w:w="60" w:type="dxa"/>
+              <w:right w:w="60" w:type="dxa"/>
+            </w:tcMar>
+          </w:tcPr>
+          <w:p>
+            <w:pPr>
+              <w:spacing w:before="10" w:after="10" w:line="240" w:lineRule="auto"/>
+            </w:pPr>
+            <w:r>
+              <w:rPr>
+                <w:rFonts w:ascii="Calibri" w:hAnsi="Calibri"/>
+                <w:b w:val="0"/>
+                <w:i w:val="0"/>
+                <w:sz w:val="13"/>
+              </w:rPr>
+              <w:t>Entra ID; workspace roles; Purview labels; private link</w:t>
+            </w:r>
+          </w:p>
+        </w:tc>
+        <w:tc>
+          <w:tcPr>
+            <w:tcW w:type="dxa" w:w="4608"/>
+            <w:tcMar>
+              <w:top w:w="30" w:type="dxa"/>
+              <w:bottom w:w="30" w:type="dxa"/>
+              <w:left w:w="60" w:type="dxa"/>
+              <w:right w:w="60" w:type="dxa"/>
+            </w:tcMar>
+          </w:tcPr>
+          <w:p>
+            <w:pPr>
+              <w:spacing w:before="10" w:after="10" w:line="240" w:lineRule="auto"/>
+            </w:pPr>
+            <w:r>
+              <w:rPr>
+                <w:rFonts w:ascii="Calibri" w:hAnsi="Calibri"/>
+                <w:b w:val="0"/>
+                <w:i w:val="0"/>
+                <w:sz w:val="13"/>
+              </w:rPr>
+              <w:t>Unity Catalog perms; Entra/SCIM; secrets; cluster policies; private link</w:t>
+            </w:r>
+          </w:p>
+        </w:tc>
+      </w:tr>
+      <w:tr>
+        <w:tc>
+          <w:tcPr>
+            <w:tcW w:type="dxa" w:w="1656"/>
+            <w:tcMar>
+              <w:top w:w="30" w:type="dxa"/>
+              <w:bottom w:w="30" w:type="dxa"/>
+              <w:left w:w="60" w:type="dxa"/>
+              <w:right w:w="60" w:type="dxa"/>
+            </w:tcMar>
+            <w:shd w:val="clear" w:fill="EEF2F8"/>
+          </w:tcPr>
+          <w:p>
+            <w:pPr>
+              <w:spacing w:before="10" w:after="10" w:line="240" w:lineRule="auto"/>
+            </w:pPr>
+            <w:r>
+              <w:rPr>
+                <w:rFonts w:ascii="Calibri" w:hAnsi="Calibri"/>
+                <w:b/>
+                <w:i w:val="0"/>
+                <w:color w:val="1F4E79"/>
+                <w:sz w:val="13"/>
+              </w:rPr>
+              <w:t>Capacity / cost</w:t>
+            </w:r>
+          </w:p>
+        </w:tc>
+        <w:tc>
+          <w:tcPr>
+            <w:tcW w:type="dxa" w:w="4536"/>
+            <w:tcMar>
+              <w:top w:w="30" w:type="dxa"/>
+              <w:bottom w:w="30" w:type="dxa"/>
+              <w:left w:w="60" w:type="dxa"/>
+              <w:right w:w="60" w:type="dxa"/>
+            </w:tcMar>
+            <w:shd w:val="clear" w:fill="EEF2F8"/>
+          </w:tcPr>
+          <w:p>
+            <w:pPr>
+              <w:spacing w:before="10" w:after="10" w:line="240" w:lineRule="auto"/>
+            </w:pPr>
+            <w:r>
+              <w:rPr>
+                <w:rFonts w:ascii="Calibri" w:hAnsi="Calibri"/>
+                <w:b w:val="0"/>
+                <w:i w:val="0"/>
+                <w:sz w:val="13"/>
+              </w:rPr>
+              <w:t>Capacity SKU (F-SKU; F64 = Copilot threshold); pause non-prod</w:t>
+            </w:r>
+          </w:p>
+        </w:tc>
+        <w:tc>
+          <w:tcPr>
+            <w:tcW w:type="dxa" w:w="4608"/>
+            <w:tcMar>
+              <w:top w:w="30" w:type="dxa"/>
+              <w:bottom w:w="30" w:type="dxa"/>
+              <w:left w:w="60" w:type="dxa"/>
+              <w:right w:w="60" w:type="dxa"/>
+            </w:tcMar>
+            <w:shd w:val="clear" w:fill="EEF2F8"/>
+          </w:tcPr>
+          <w:p>
+            <w:pPr>
+              <w:spacing w:before="10" w:after="10" w:line="240" w:lineRule="auto"/>
+            </w:pPr>
+            <w:r>
+              <w:rPr>
+                <w:rFonts w:ascii="Calibri" w:hAnsi="Calibri"/>
+                <w:b w:val="0"/>
+                <w:i w:val="0"/>
+                <w:sz w:val="13"/>
+              </w:rPr>
+              <w:t>DBUs (job/all-purpose/SQL); serverless; Photon; spot; autoscale</w:t>
+            </w:r>
+          </w:p>
+        </w:tc>
+      </w:tr>
+    </w:tbl>
+    <w:p>
+      <w:pPr>
+        <w:spacing w:before="80" w:after="0"/>
+      </w:pPr>
+      <w:r>
+        <w:rPr>
+          <w:rFonts w:ascii="Calibri" w:hAnsi="Calibri"/>
+          <w:b/>
+          <w:i w:val="0"/>
+          <w:color w:val="1F4E79"/>
+          <w:sz w:val="14"/>
+        </w:rPr>
+        <w:t xml:space="preserve">Naming gotchas: </w:t>
+      </w:r>
+      <w:r>
+        <w:rPr>
+          <w:rFonts w:ascii="Calibri" w:hAnsi="Calibri"/>
+          <w:b w:val="0"/>
+          <w:i w:val="0"/>
+          <w:sz w:val="14"/>
+        </w:rPr>
+        <w:t>Databricks 'Lakeflow' = Connect (ingest) + Declarative Pipelines (was DLT) + Jobs (was Workflows).  Fabric Direct Lake = query OneLake Delta with no import/refresh.  UniForm = Delta readable as Iceberg.  Both: medallion bronze→silver→gold.  Pick by center of gravity — BI/SaaS → Fabric; engineering/ML/scale → Databricks; often both over one Delta copy.</w:t>
+      </w:r>
+    </w:p>
     <w:sectPr>
       <w:pgSz w:w="12240" w:h="15840"/>
       <w:pgMar w:top="504" w:right="576" w:bottom="432" w:left="576" w:header="720" w:footer="720" w:gutter="0"/>

</xml_diff>